<commit_message>
Update ERS course information and rules
</commit_message>
<xml_diff>
--- a/Elementi razvoja softvera (ERS)/Opšte informacije/ERS_Pravila_Polaganja.docx
+++ b/Elementi razvoja softvera (ERS)/Opšte informacije/ERS_Pravila_Polaganja.docx
@@ -165,10 +165,13 @@
         <w:keepNext/>
         <w:spacing w:before="3005" w:after="220"/>
         <w:jc w:val="center"/>
-      </w:pPr>
-      <w:r>
         <w:rPr>
-          <w:rFonts w:ascii="Liberation Serif" w:hAnsi="Liberation Serif"/>
+          <w:rFonts w:ascii="Liberation Serif" w:hAnsi="Liberation Serif" w:cs="Liberation Serif"/>
+        </w:rPr>
+      </w:pPr>
+      <w:r>
+        <w:rPr>
+          <w:rFonts w:ascii="Liberation Serif" w:hAnsi="Liberation Serif" w:cs="Liberation Serif"/>
           <w:color w:val="161616"/>
           <w:sz w:val="52"/>
         </w:rPr>
@@ -181,12 +184,13 @@
         <w:spacing w:after="0"/>
         <w:jc w:val="center"/>
         <w:rPr>
+          <w:rFonts w:ascii="Liberation Serif" w:hAnsi="Liberation Serif" w:cs="Liberation Serif"/>
           <w:lang w:val="en-US"/>
         </w:rPr>
       </w:pPr>
       <w:r>
         <w:rPr>
-          <w:rFonts w:ascii="Liberation Serif" w:hAnsi="Liberation Serif"/>
+          <w:rFonts w:ascii="Liberation Serif" w:hAnsi="Liberation Serif" w:cs="Liberation Serif"/>
           <w:color w:val="161616"/>
           <w:sz w:val="32"/>
         </w:rPr>
@@ -271,12 +275,6 @@
           <w:szCs w:val="30"/>
         </w:rPr>
         <w:br/>
-      </w:r>
-      <w:r>
-        <w:rPr>
-          <w:sz w:val="30"/>
-          <w:szCs w:val="30"/>
-        </w:rPr>
         <w:t>Нови Сад, 2026</w:t>
       </w:r>
     </w:p>
@@ -285,8 +283,14 @@
         <w:pStyle w:val="Heading1"/>
         <w:pageBreakBefore/>
         <w:spacing w:after="360"/>
-      </w:pPr>
-      <w:r>
+        <w:rPr>
+          <w:rFonts w:ascii="Liberation Serif" w:hAnsi="Liberation Serif" w:cs="Liberation Serif"/>
+        </w:rPr>
+      </w:pPr>
+      <w:r>
+        <w:rPr>
+          <w:rFonts w:ascii="Liberation Serif" w:hAnsi="Liberation Serif" w:cs="Liberation Serif"/>
+        </w:rPr>
         <w:lastRenderedPageBreak/>
         <w:t>Садржај</w:t>
       </w:r>
@@ -764,6 +768,9 @@
       <w:pPr>
         <w:pStyle w:val="Heading1"/>
         <w:pageBreakBefore/>
+        <w:rPr>
+          <w:rFonts w:ascii="Liberation Serif" w:hAnsi="Liberation Serif" w:cs="Liberation Serif"/>
+        </w:rPr>
       </w:pPr>
       <w:bookmarkStart w:id="0" w:name="ers_pravila_01"/>
       <w:r>
@@ -1750,6 +1757,9 @@
     <w:p>
       <w:pPr>
         <w:pStyle w:val="Heading2"/>
+        <w:rPr>
+          <w:rFonts w:ascii="Liberation Serif" w:hAnsi="Liberation Serif" w:cs="Liberation Serif"/>
+        </w:rPr>
       </w:pPr>
       <w:bookmarkStart w:id="2" w:name="ers_pravila_03"/>
       <w:r>
@@ -3953,11 +3963,14 @@
     <w:p>
       <w:pPr>
         <w:pStyle w:val="Heading2"/>
+        <w:rPr>
+          <w:rFonts w:ascii="Liberation Serif" w:hAnsi="Liberation Serif" w:cs="Liberation Serif"/>
+        </w:rPr>
       </w:pPr>
       <w:bookmarkStart w:id="5" w:name="ers_pravila_06"/>
       <w:r>
         <w:rPr>
-          <w:rFonts w:ascii="Liberation Serif" w:hAnsi="Liberation Serif"/>
+          <w:rFonts w:ascii="Liberation Serif" w:hAnsi="Liberation Serif" w:cs="Liberation Serif"/>
           <w:sz w:val="24"/>
         </w:rPr>
         <w:t>4.1 КТ1 — Основна имплементација (5. недеља)</w:t>
@@ -4021,11 +4034,14 @@
     <w:p>
       <w:pPr>
         <w:pStyle w:val="Heading2"/>
+        <w:rPr>
+          <w:rFonts w:ascii="Liberation Serif" w:hAnsi="Liberation Serif" w:cs="Liberation Serif"/>
+        </w:rPr>
       </w:pPr>
       <w:bookmarkStart w:id="6" w:name="ers_pravila_07"/>
       <w:r>
         <w:rPr>
-          <w:rFonts w:ascii="Liberation Serif" w:hAnsi="Liberation Serif"/>
+          <w:rFonts w:ascii="Liberation Serif" w:hAnsi="Liberation Serif" w:cs="Liberation Serif"/>
           <w:sz w:val="24"/>
         </w:rPr>
         <w:t>4.2 КТ2 — Интеграциона провера и демонстрација напретка (9. недеља)</w:t>
@@ -4233,11 +4249,14 @@
     <w:p>
       <w:pPr>
         <w:pStyle w:val="Heading2"/>
+        <w:rPr>
+          <w:rFonts w:ascii="Liberation Serif" w:hAnsi="Liberation Serif" w:cs="Liberation Serif"/>
+        </w:rPr>
       </w:pPr>
       <w:bookmarkStart w:id="9" w:name="ers_pravila_10"/>
       <w:r>
         <w:rPr>
-          <w:rFonts w:ascii="Liberation Serif" w:hAnsi="Liberation Serif"/>
+          <w:rFonts w:ascii="Liberation Serif" w:hAnsi="Liberation Serif" w:cs="Liberation Serif"/>
           <w:sz w:val="24"/>
         </w:rPr>
         <w:lastRenderedPageBreak/>
@@ -4336,11 +4355,14 @@
     <w:p>
       <w:pPr>
         <w:pStyle w:val="Heading2"/>
+        <w:rPr>
+          <w:rFonts w:ascii="Liberation Serif" w:hAnsi="Liberation Serif" w:cs="Liberation Serif"/>
+        </w:rPr>
       </w:pPr>
       <w:bookmarkStart w:id="10" w:name="ers_pravila_11"/>
       <w:r>
         <w:rPr>
-          <w:rFonts w:ascii="Liberation Serif" w:hAnsi="Liberation Serif"/>
+          <w:rFonts w:ascii="Liberation Serif" w:hAnsi="Liberation Serif" w:cs="Liberation Serif"/>
           <w:sz w:val="24"/>
         </w:rPr>
         <w:t>6.2 Начин рада у репозиторијуму</w:t>
@@ -4428,11 +4450,14 @@
     <w:p>
       <w:pPr>
         <w:pStyle w:val="Heading2"/>
+        <w:rPr>
+          <w:rFonts w:ascii="Liberation Serif" w:hAnsi="Liberation Serif" w:cs="Liberation Serif"/>
+        </w:rPr>
       </w:pPr>
       <w:bookmarkStart w:id="11" w:name="ers_pravila_12"/>
       <w:r>
         <w:rPr>
-          <w:rFonts w:ascii="Liberation Serif" w:hAnsi="Liberation Serif"/>
+          <w:rFonts w:ascii="Liberation Serif" w:hAnsi="Liberation Serif" w:cs="Liberation Serif"/>
           <w:sz w:val="24"/>
         </w:rPr>
         <w:t>6.3 Минимална очекивања од пројектне целине</w:t>
@@ -4928,11 +4953,14 @@
     <w:p>
       <w:pPr>
         <w:pStyle w:val="Heading2"/>
+        <w:rPr>
+          <w:rFonts w:ascii="Liberation Serif" w:hAnsi="Liberation Serif" w:cs="Liberation Serif"/>
+        </w:rPr>
       </w:pPr>
       <w:bookmarkStart w:id="13" w:name="ers_pravila_14"/>
       <w:r>
         <w:rPr>
-          <w:rFonts w:ascii="Liberation Serif" w:hAnsi="Liberation Serif"/>
+          <w:rFonts w:ascii="Liberation Serif" w:hAnsi="Liberation Serif" w:cs="Liberation Serif"/>
           <w:sz w:val="24"/>
         </w:rPr>
         <w:t>7.1 Одбрана пројекта</w:t>
@@ -4987,11 +5015,14 @@
     <w:p>
       <w:pPr>
         <w:pStyle w:val="Heading2"/>
+        <w:rPr>
+          <w:rFonts w:ascii="Liberation Serif" w:hAnsi="Liberation Serif" w:cs="Liberation Serif"/>
+        </w:rPr>
       </w:pPr>
       <w:bookmarkStart w:id="14" w:name="ers_pravila_15"/>
       <w:r>
         <w:rPr>
-          <w:rFonts w:ascii="Liberation Serif" w:hAnsi="Liberation Serif"/>
+          <w:rFonts w:ascii="Liberation Serif" w:hAnsi="Liberation Serif" w:cs="Liberation Serif"/>
           <w:sz w:val="24"/>
         </w:rPr>
         <w:t>7.2 Теоријска питања</w:t>

</xml_diff>